<commit_message>
Show separate A B C results in template report
</commit_message>
<xml_diff>
--- a/CLOUD_DOCS/Отчет по исходному шаблону.docx
+++ b/CLOUD_DOCS/Отчет по исходному шаблону.docx
@@ -2186,7 +2186,7 @@
           <w:highlight w:val="yellow"/>
           <w:rtl w:val="0"/>
         </w:rPr>
-        <w:t>Результаты для 12 исходных вопросов в каждом режиме приведены в таблице 3. Точность статуса включает невалидные ответы как ошибки; остальные метрики рассчитаны по валидным: 10 в A, 12 в B/C.</w:t>
+        <w:t>Результаты для 12 исходных вопросов в каждом режиме приведены в таблице 3. Точность статуса включает невалидные ответы как ошибки; остальные метрики рассчитаны по валидным: 10 в A, 12 в B и C. Для both и insufficient в исходном наборе только по два вопроса.</w:t>
       </w:r>
     </w:p>
     <w:p>
@@ -2235,6 +2235,8 @@
         <w:trPr>
           <w:cantSplit w:val="0"/>
           <w:tblHeader w:val="0"/>
+          <w:cantSplit/>
+          <w:tblHeader/>
         </w:trPr>
         <w:tc>
           <w:tcPr>
@@ -2319,6 +2321,7 @@
         <w:trPr>
           <w:cantSplit w:val="0"/>
           <w:tblHeader w:val="0"/>
+          <w:cantSplit/>
         </w:trPr>
         <w:tc>
           <w:tcPr/>
@@ -2353,33 +2356,36 @@
             </w:pPr>
             <w:r>
               <w:rPr>
+                <w:rtl w:val="0"/>
+              </w:rPr>
+              <w:t xml:space="preserve">Доля вопросов с верно предсказанным статусом</w:t>
+            </w:r>
+            <w:r>
+              <w:rPr>
+                <w:rtl w:val="0"/>
+              </w:rPr>
+            </w:r>
+          </w:p>
+        </w:tc>
+        <w:tc>
+          <w:tcPr/>
+          <w:p>
+            <w:pPr>
+              <w:spacing w:after="0" w:line="240" w:lineRule="auto"/>
+              <w:ind w:right="290.6692913385831" w:firstLine="0"/>
+              <w:jc w:val="left"/>
+              <w:rPr/>
+            </w:pPr>
+            <w:r>
+              <w:rPr>
                 <w:highlight w:val="yellow"/>
                 <w:rtl w:val="0"/>
               </w:rPr>
-              <w:t>Доля верных статусов</w:t>
-            </w:r>
-            <w:r>
-              <w:rPr>
-                <w:rtl w:val="0"/>
-              </w:rPr>
-            </w:r>
-          </w:p>
-        </w:tc>
-        <w:tc>
-          <w:tcPr/>
-          <w:p>
-            <w:pPr>
-              <w:spacing w:after="0" w:line="240" w:lineRule="auto"/>
-              <w:ind w:right="290.6692913385831" w:firstLine="0"/>
-              <w:jc w:val="left"/>
-              <w:rPr/>
-            </w:pPr>
-            <w:r>
-              <w:rPr>
-                <w:highlight w:val="yellow"/>
-                <w:rtl w:val="0"/>
-              </w:rPr>
-              <w:t>A/B/C: 10/12</w:t>
+              <w:t>A: 10/12</w:t>
+              <w:br/>
+              <w:t>B: 10/12</w:t>
+              <w:br/>
+              <w:t>C: 10/12</w:t>
             </w:r>
           </w:p>
           <w:p>
@@ -2419,6 +2425,7 @@
         <w:trPr>
           <w:cantSplit w:val="0"/>
           <w:tblHeader w:val="0"/>
+          <w:cantSplit/>
         </w:trPr>
         <w:tc>
           <w:tcPr/>
@@ -2453,33 +2460,36 @@
             </w:pPr>
             <w:r>
               <w:rPr>
+                <w:rtl w:val="0"/>
+              </w:rPr>
+              <w:t xml:space="preserve">Доля найденных моделью доказательств, которые являются корректными</w:t>
+            </w:r>
+            <w:r>
+              <w:rPr>
+                <w:rtl w:val="0"/>
+              </w:rPr>
+            </w:r>
+          </w:p>
+        </w:tc>
+        <w:tc>
+          <w:tcPr/>
+          <w:p>
+            <w:pPr>
+              <w:spacing w:after="0" w:line="240" w:lineRule="auto"/>
+              <w:ind w:right="290.6692913385831" w:firstLine="0"/>
+              <w:jc w:val="left"/>
+              <w:rPr/>
+            </w:pPr>
+            <w:r>
+              <w:rPr>
                 <w:highlight w:val="yellow"/>
                 <w:rtl w:val="0"/>
               </w:rPr>
-              <w:t>Доля верных найденных ID</w:t>
-            </w:r>
-            <w:r>
-              <w:rPr>
-                <w:rtl w:val="0"/>
-              </w:rPr>
-            </w:r>
-          </w:p>
-        </w:tc>
-        <w:tc>
-          <w:tcPr/>
-          <w:p>
-            <w:pPr>
-              <w:spacing w:after="0" w:line="240" w:lineRule="auto"/>
-              <w:ind w:right="290.6692913385831" w:firstLine="0"/>
-              <w:jc w:val="left"/>
-              <w:rPr/>
-            </w:pPr>
-            <w:r>
-              <w:rPr>
-                <w:highlight w:val="yellow"/>
-                <w:rtl w:val="0"/>
-              </w:rPr>
-              <w:t>A/B/C: 1,00</w:t>
+              <w:t>A: 1,00</w:t>
+              <w:br/>
+              <w:t>B: 1,00</w:t>
+              <w:br/>
+              <w:t>C: 1,00</w:t>
             </w:r>
           </w:p>
           <w:p>
@@ -2519,6 +2529,7 @@
         <w:trPr>
           <w:cantSplit w:val="0"/>
           <w:tblHeader w:val="0"/>
+          <w:cantSplit/>
         </w:trPr>
         <w:tc>
           <w:tcPr/>
@@ -2553,33 +2564,36 @@
             </w:pPr>
             <w:r>
               <w:rPr>
+                <w:rtl w:val="0"/>
+              </w:rPr>
+              <w:t xml:space="preserve">Доля эталонных доказательств, найденных моделью</w:t>
+            </w:r>
+            <w:r>
+              <w:rPr>
+                <w:rtl w:val="0"/>
+              </w:rPr>
+            </w:r>
+          </w:p>
+        </w:tc>
+        <w:tc>
+          <w:tcPr/>
+          <w:p>
+            <w:pPr>
+              <w:spacing w:after="0" w:line="240" w:lineRule="auto"/>
+              <w:ind w:right="290.6692913385831" w:firstLine="0"/>
+              <w:jc w:val="left"/>
+              <w:rPr/>
+            </w:pPr>
+            <w:r>
+              <w:rPr>
                 <w:highlight w:val="yellow"/>
                 <w:rtl w:val="0"/>
               </w:rPr>
-              <w:t>Доля найденных эталонных ID</w:t>
-            </w:r>
-            <w:r>
-              <w:rPr>
-                <w:rtl w:val="0"/>
-              </w:rPr>
-            </w:r>
-          </w:p>
-        </w:tc>
-        <w:tc>
-          <w:tcPr/>
-          <w:p>
-            <w:pPr>
-              <w:spacing w:after="0" w:line="240" w:lineRule="auto"/>
-              <w:ind w:right="290.6692913385831" w:firstLine="0"/>
-              <w:jc w:val="left"/>
-              <w:rPr/>
-            </w:pPr>
-            <w:r>
-              <w:rPr>
-                <w:highlight w:val="yellow"/>
-                <w:rtl w:val="0"/>
-              </w:rPr>
-              <w:t>A: 1,00; B/C: 0,39</w:t>
+              <w:t>A: 1,00</w:t>
+              <w:br/>
+              <w:t>B: 0,39</w:t>
+              <w:br/>
+              <w:t>C: 0,39</w:t>
             </w:r>
           </w:p>
           <w:p>
@@ -2619,6 +2633,7 @@
         <w:trPr>
           <w:cantSplit w:val="0"/>
           <w:tblHeader w:val="0"/>
+          <w:cantSplit/>
         </w:trPr>
         <w:tc>
           <w:tcPr/>
@@ -2653,33 +2668,36 @@
             </w:pPr>
             <w:r>
               <w:rPr>
+                <w:rtl w:val="0"/>
+              </w:rPr>
+              <w:t xml:space="preserve">Гармоническое среднее precision и recall для доказательств</w:t>
+            </w:r>
+            <w:r>
+              <w:rPr>
+                <w:rtl w:val="0"/>
+              </w:rPr>
+            </w:r>
+          </w:p>
+        </w:tc>
+        <w:tc>
+          <w:tcPr/>
+          <w:p>
+            <w:pPr>
+              <w:spacing w:after="0" w:line="240" w:lineRule="auto"/>
+              <w:ind w:right="290.6692913385831" w:firstLine="0"/>
+              <w:jc w:val="left"/>
+              <w:rPr/>
+            </w:pPr>
+            <w:r>
+              <w:rPr>
                 <w:highlight w:val="yellow"/>
                 <w:rtl w:val="0"/>
               </w:rPr>
-              <w:t>Среднее precision и recall</w:t>
-            </w:r>
-            <w:r>
-              <w:rPr>
-                <w:rtl w:val="0"/>
-              </w:rPr>
-            </w:r>
-          </w:p>
-        </w:tc>
-        <w:tc>
-          <w:tcPr/>
-          <w:p>
-            <w:pPr>
-              <w:spacing w:after="0" w:line="240" w:lineRule="auto"/>
-              <w:ind w:right="290.6692913385831" w:firstLine="0"/>
-              <w:jc w:val="left"/>
-              <w:rPr/>
-            </w:pPr>
-            <w:r>
-              <w:rPr>
-                <w:highlight w:val="yellow"/>
-                <w:rtl w:val="0"/>
-              </w:rPr>
-              <w:t>A: 1,00; B/C: 0,56</w:t>
+              <w:t>A: 1,00</w:t>
+              <w:br/>
+              <w:t>B: 0,56</w:t>
+              <w:br/>
+              <w:t>C: 0,56</w:t>
             </w:r>
           </w:p>
           <w:p>
@@ -2719,6 +2737,7 @@
         <w:trPr>
           <w:cantSplit w:val="0"/>
           <w:tblHeader w:val="0"/>
+          <w:cantSplit/>
         </w:trPr>
         <w:tc>
           <w:tcPr/>
@@ -2753,33 +2772,36 @@
             </w:pPr>
             <w:r>
               <w:rPr>
+                <w:rtl w:val="0"/>
+              </w:rPr>
+              <w:t xml:space="preserve">Доля эталонных контрдоказательств, найденных моделью</w:t>
+            </w:r>
+            <w:r>
+              <w:rPr>
+                <w:rtl w:val="0"/>
+              </w:rPr>
+            </w:r>
+          </w:p>
+        </w:tc>
+        <w:tc>
+          <w:tcPr/>
+          <w:p>
+            <w:pPr>
+              <w:spacing w:after="0" w:line="240" w:lineRule="auto"/>
+              <w:ind w:right="290.6692913385831" w:firstLine="0"/>
+              <w:jc w:val="left"/>
+              <w:rPr/>
+            </w:pPr>
+            <w:r>
+              <w:rPr>
                 <w:highlight w:val="yellow"/>
                 <w:rtl w:val="0"/>
               </w:rPr>
-              <w:t>Доля найденных контр-ID</w:t>
-            </w:r>
-            <w:r>
-              <w:rPr>
-                <w:rtl w:val="0"/>
-              </w:rPr>
-            </w:r>
-          </w:p>
-        </w:tc>
-        <w:tc>
-          <w:tcPr/>
-          <w:p>
-            <w:pPr>
-              <w:spacing w:after="0" w:line="240" w:lineRule="auto"/>
-              <w:ind w:right="290.6692913385831" w:firstLine="0"/>
-              <w:jc w:val="left"/>
-              <w:rPr/>
-            </w:pPr>
-            <w:r>
-              <w:rPr>
-                <w:highlight w:val="yellow"/>
-                <w:rtl w:val="0"/>
-              </w:rPr>
-              <w:t>A/B/C: 1,00</w:t>
+              <w:t>A: 1,00</w:t>
+              <w:br/>
+              <w:t>B: 1,00</w:t>
+              <w:br/>
+              <w:t>C: 1,00</w:t>
             </w:r>
           </w:p>
           <w:p>
@@ -2819,6 +2841,7 @@
         <w:trPr>
           <w:cantSplit w:val="0"/>
           <w:tblHeader w:val="0"/>
+          <w:cantSplit/>
         </w:trPr>
         <w:tc>
           <w:tcPr/>
@@ -2853,33 +2876,36 @@
             </w:pPr>
             <w:r>
               <w:rPr>
+                <w:rtl w:val="0"/>
+              </w:rPr>
+              <w:t xml:space="preserve">Качество выявления одновременно подтверждающих и опровергающих оснований</w:t>
+            </w:r>
+            <w:r>
+              <w:rPr>
+                <w:rtl w:val="0"/>
+              </w:rPr>
+            </w:r>
+          </w:p>
+        </w:tc>
+        <w:tc>
+          <w:tcPr/>
+          <w:p>
+            <w:pPr>
+              <w:spacing w:after="0" w:line="240" w:lineRule="auto"/>
+              <w:ind w:right="290.6692913385831" w:firstLine="0"/>
+              <w:jc w:val="left"/>
+              <w:rPr/>
+            </w:pPr>
+            <w:r>
+              <w:rPr>
                 <w:highlight w:val="yellow"/>
                 <w:rtl w:val="0"/>
               </w:rPr>
-              <w:t>Recall для both</w:t>
-            </w:r>
-            <w:r>
-              <w:rPr>
-                <w:rtl w:val="0"/>
-              </w:rPr>
-            </w:r>
-          </w:p>
-        </w:tc>
-        <w:tc>
-          <w:tcPr/>
-          <w:p>
-            <w:pPr>
-              <w:spacing w:after="0" w:line="240" w:lineRule="auto"/>
-              <w:ind w:right="290.6692913385831" w:firstLine="0"/>
-              <w:jc w:val="left"/>
-              <w:rPr/>
-            </w:pPr>
-            <w:r>
-              <w:rPr>
-                <w:highlight w:val="yellow"/>
-                <w:rtl w:val="0"/>
-              </w:rPr>
-              <w:t>A/B/C: 1,00 (n=2)</w:t>
+              <w:t>A: 1,00</w:t>
+              <w:br/>
+              <w:t>B: 1,00</w:t>
+              <w:br/>
+              <w:t>C: 1,00</w:t>
             </w:r>
           </w:p>
           <w:p>
@@ -2919,6 +2945,7 @@
         <w:trPr>
           <w:cantSplit w:val="0"/>
           <w:tblHeader w:val="0"/>
+          <w:cantSplit/>
         </w:trPr>
         <w:tc>
           <w:tcPr/>
@@ -2953,33 +2980,36 @@
             </w:pPr>
             <w:r>
               <w:rPr>
+                <w:rtl w:val="0"/>
+              </w:rPr>
+              <w:t xml:space="preserve">Качество распознавания недостаточности данных</w:t>
+            </w:r>
+            <w:r>
+              <w:rPr>
+                <w:rtl w:val="0"/>
+              </w:rPr>
+            </w:r>
+          </w:p>
+        </w:tc>
+        <w:tc>
+          <w:tcPr/>
+          <w:p>
+            <w:pPr>
+              <w:spacing w:after="0" w:line="240" w:lineRule="auto"/>
+              <w:ind w:right="290.6692913385831" w:firstLine="0"/>
+              <w:jc w:val="left"/>
+              <w:rPr/>
+            </w:pPr>
+            <w:r>
+              <w:rPr>
                 <w:highlight w:val="yellow"/>
                 <w:rtl w:val="0"/>
               </w:rPr>
-              <w:t>Recall для insufficient</w:t>
-            </w:r>
-            <w:r>
-              <w:rPr>
-                <w:rtl w:val="0"/>
-              </w:rPr>
-            </w:r>
-          </w:p>
-        </w:tc>
-        <w:tc>
-          <w:tcPr/>
-          <w:p>
-            <w:pPr>
-              <w:spacing w:after="0" w:line="240" w:lineRule="auto"/>
-              <w:ind w:right="290.6692913385831" w:firstLine="0"/>
-              <w:jc w:val="left"/>
-              <w:rPr/>
-            </w:pPr>
-            <w:r>
-              <w:rPr>
-                <w:highlight w:val="yellow"/>
-                <w:rtl w:val="0"/>
-              </w:rPr>
-              <w:t>A/B/C: 1,00 (n=2)</w:t>
+              <w:t>A: 1,00</w:t>
+              <w:br/>
+              <w:t>B: 1,00</w:t>
+              <w:br/>
+              <w:t>C: 1,00</w:t>
             </w:r>
           </w:p>
           <w:p>
@@ -3019,6 +3049,7 @@
         <w:trPr>
           <w:cantSplit w:val="0"/>
           <w:tblHeader w:val="0"/>
+          <w:cantSplit/>
         </w:trPr>
         <w:tc>
           <w:tcPr/>
@@ -3053,33 +3084,36 @@
             </w:pPr>
             <w:r>
               <w:rPr>
+                <w:rtl w:val="0"/>
+              </w:rPr>
+              <w:t xml:space="preserve">Доля случаев недостатка данных с неоправданно высокой уверенностью</w:t>
+            </w:r>
+            <w:r>
+              <w:rPr>
+                <w:rtl w:val="0"/>
+              </w:rPr>
+            </w:r>
+          </w:p>
+        </w:tc>
+        <w:tc>
+          <w:tcPr/>
+          <w:p>
+            <w:pPr>
+              <w:spacing w:after="0" w:line="240" w:lineRule="auto"/>
+              <w:ind w:right="290.6692913385831" w:firstLine="0"/>
+              <w:jc w:val="left"/>
+              <w:rPr/>
+            </w:pPr>
+            <w:r>
+              <w:rPr>
                 <w:highlight w:val="yellow"/>
                 <w:rtl w:val="0"/>
               </w:rPr>
-              <w:t>Уверенные догадки при insufficient</w:t>
-            </w:r>
-            <w:r>
-              <w:rPr>
-                <w:rtl w:val="0"/>
-              </w:rPr>
-            </w:r>
-          </w:p>
-        </w:tc>
-        <w:tc>
-          <w:tcPr/>
-          <w:p>
-            <w:pPr>
-              <w:spacing w:after="0" w:line="240" w:lineRule="auto"/>
-              <w:ind w:right="290.6692913385831" w:firstLine="0"/>
-              <w:jc w:val="left"/>
-              <w:rPr/>
-            </w:pPr>
-            <w:r>
-              <w:rPr>
-                <w:highlight w:val="yellow"/>
-                <w:rtl w:val="0"/>
-              </w:rPr>
-              <w:t>A/B/C: 0,00</w:t>
+              <w:t>A: 0,00</w:t>
+              <w:br/>
+              <w:t>B: 0,00</w:t>
+              <w:br/>
+              <w:t>C: 0,00</w:t>
             </w:r>
           </w:p>
           <w:p>
@@ -3119,6 +3153,7 @@
         <w:trPr>
           <w:cantSplit w:val="0"/>
           <w:tblHeader w:val="0"/>
+          <w:cantSplit/>
         </w:trPr>
         <w:tc>
           <w:tcPr/>
@@ -3153,33 +3188,36 @@
             </w:pPr>
             <w:r>
               <w:rPr>
+                <w:rtl w:val="0"/>
+              </w:rPr>
+              <w:t xml:space="preserve">Стоимость и скорость обработки</w:t>
+            </w:r>
+            <w:r>
+              <w:rPr>
+                <w:rtl w:val="0"/>
+              </w:rPr>
+            </w:r>
+          </w:p>
+        </w:tc>
+        <w:tc>
+          <w:tcPr/>
+          <w:p>
+            <w:pPr>
+              <w:spacing w:after="0" w:line="240" w:lineRule="auto"/>
+              <w:ind w:right="290.6692913385831" w:firstLine="0"/>
+              <w:jc w:val="left"/>
+              <w:rPr/>
+            </w:pPr>
+            <w:r>
+              <w:rPr>
                 <w:highlight w:val="yellow"/>
                 <w:rtl w:val="0"/>
               </w:rPr>
-              <w:t>Средний вход и время ответа</w:t>
-            </w:r>
-            <w:r>
-              <w:rPr>
-                <w:rtl w:val="0"/>
-              </w:rPr>
-            </w:r>
-          </w:p>
-        </w:tc>
-        <w:tc>
-          <w:tcPr/>
-          <w:p>
-            <w:pPr>
-              <w:spacing w:after="0" w:line="240" w:lineRule="auto"/>
-              <w:ind w:right="290.6692913385831" w:firstLine="0"/>
-              <w:jc w:val="left"/>
-              <w:rPr/>
-            </w:pPr>
-            <w:r>
-              <w:rPr>
-                <w:highlight w:val="yellow"/>
-                <w:rtl w:val="0"/>
-              </w:rPr>
-              <w:t>Вход A/B/C: 12 274 / 921 / 1117; время: 1,95 / 1,35 / 1,41 с</w:t>
+              <w:t>A: 12 274; 1,95 с</w:t>
+              <w:br/>
+              <w:t>B: 921; 1,35 с</w:t>
+              <w:br/>
+              <w:t>C: 1117; 1,41 с</w:t>
             </w:r>
             <w:r>
               <w:rPr>
@@ -3272,6 +3310,8 @@
         <w:trPr>
           <w:cantSplit w:val="0"/>
           <w:tblHeader w:val="0"/>
+          <w:cantSplit/>
+          <w:tblHeader/>
         </w:trPr>
         <w:tc>
           <w:tcPr>
@@ -3353,6 +3393,7 @@
         <w:trPr>
           <w:cantSplit w:val="0"/>
           <w:tblHeader w:val="0"/>
+          <w:cantSplit/>
         </w:trPr>
         <w:tc>
           <w:tcPr/>
@@ -3424,6 +3465,7 @@
         <w:trPr>
           <w:cantSplit w:val="0"/>
           <w:tblHeader w:val="0"/>
+          <w:cantSplit/>
         </w:trPr>
         <w:tc>
           <w:tcPr/>
@@ -3495,6 +3537,7 @@
         <w:trPr>
           <w:cantSplit w:val="0"/>
           <w:tblHeader w:val="0"/>
+          <w:cantSplit/>
         </w:trPr>
         <w:tc>
           <w:tcPr/>

</xml_diff>

<commit_message>
Restore template conclusion and add experiment findings
</commit_message>
<xml_diff>
--- a/CLOUD_DOCS/Отчет по исходному шаблону.docx
+++ b/CLOUD_DOCS/Отчет по исходному шаблону.docx
@@ -4283,10 +4283,9 @@
       </w:pPr>
       <w:r>
         <w:rPr>
-          <w:highlight w:val="yellow"/>
-          <w:rtl w:val="0"/>
-        </w:rPr>
-        <w:t>На одном вымышленном корпусе одна модель одинаково часто верно определила статус в A, B и C: по 10 из 12 исходных вопросов. Сокращение контекста снизило число токенов, но ухудшило полноту доказательств.</w:t>
+          <w:rtl w:val="0"/>
+        </w:rPr>
+        <w:t xml:space="preserve">В ходе лабораторной работы была исследована способность LLM отвечать на вопросы по длинному досье, в котором сведения распределены по нескольким документам, могут зависеть от временного порядка, содержать исключения и противоречия либо не давать достаточных оснований для однозначного ответа. Для решения задачи используются атомарные утверждения с привязкой к исходным источникам, эталонные логические статусы и ссылки на доказательства и контрдоказательства.</w:t>
       </w:r>
     </w:p>
     <w:p>
@@ -4297,10 +4296,9 @@
       </w:pPr>
       <w:r>
         <w:rPr>
-          <w:highlight w:val="yellow"/>
-          <w:rtl w:val="0"/>
-        </w:rPr>
-        <w:t>Удаление необходимой посылки чаще вызывало ожидаемый отказ от вывода, чем добавление противоречия — корректное распознавание конфликта. Группировка p-adic не дала устойчивого преимущества на этом наборе.</w:t>
+          <w:rtl w:val="0"/>
+        </w:rPr>
+        <w:t xml:space="preserve">Сравнение полного контекста, плоского retrieval BM25 и p-adic организации позволяет отдельно рассмотреть влияние объёма и структуры передаваемой модели информации. Стресс-тесты перестановки документов, удаления необходимой посылки и добавления противоречия предназначены для оценки устойчивости ответа и способности модели корректно обозначать неопределённость.</w:t>
       </w:r>
     </w:p>
     <w:p>
@@ -4314,7 +4312,7 @@
           <w:highlight w:val="yellow"/>
           <w:rtl w:val="0"/>
         </w:rPr>
-        <w:t>Ограничения: одна модель, один корпус и один прогон; температура 0 не гарантирует полной повторяемости. Для Q08 рекомендательное разъяснение спорит с действующим регламентом, поэтому вес источников неодинаков. Выводы не распространяются на другие модели и корпуса.</w:t>
+        <w:t>Точность режимов составила 10/12; A показал лучший Evidence F1: 1,00 против 0,56. P-adic преимущества не показал. Перестановки сохраняли статусы; реакция на удаление посылки была надёжнее реакции на противоречие. Ограничения: один корпус, модель, прогон.</w:t>
       </w:r>
       <w:r>
         <w:rPr>

</xml_diff>

<commit_message>
Expand evidence based experiment conclusion
</commit_message>
<xml_diff>
--- a/CLOUD_DOCS/Отчет по исходному шаблону.docx
+++ b/CLOUD_DOCS/Отчет по исходному шаблону.docx
@@ -733,7 +733,7 @@
           <w:highlight w:val="yellow"/>
           <w:rtl w:val="0"/>
         </w:rPr>
-        <w:t>Кратко приведём сюжет. 14–15 марта 2026 года Илья и Даша вопреки запрету проводят ночное испытание прототипа «Нереида». После повреждения датчика они скрывают часть обстоятельств. Досье содержит согласующиеся факты и противоречивые свидетельства.</w:t>
+        <w:t>14–15 марта 2026 года Илья и Даша вопреки запрету испытывают «Нереиду», повреждают датчик и скрывают обстоятельства.</w:t>
       </w:r>
     </w:p>
     <w:p>
@@ -760,7 +760,7 @@
           <w:highlight w:val="yellow"/>
           <w:rtl w:val="0"/>
         </w:rPr>
-        <w:t>С помощью LLM подготовлены документы досье; команда сверила их с замыслом, добавила противоречия и нерелевантные материалы. Все события и персонажи вымышлены. Объём — 5023 слова в полях text при подсчёте по пробелам.</w:t>
+        <w:t>С помощью LLM подготовлены вымышленные документы, проверенные командой. Объём досье — 5023 слова в полях text при подсчёте по пробелам.</w:t>
       </w:r>
       <w:r>
         <w:rPr>
@@ -792,7 +792,7 @@
           <w:highlight w:val="yellow"/>
           <w:rtl w:val="0"/>
         </w:rPr>
-        <w:t>Для 12 вопросов шести типов составлены эталонные статусы и ID оснований. По сообщению участника команды от 17 октября 2026 года, все участники согласовали текущие данные и 36 стресс-кейсов; личных подписей в файлах нет.</w:t>
+        <w:t>Эталоны 12 вопросов и 36 стресс-кейсов согласованы командой по сообщению участника от 17.10.2026.</w:t>
       </w:r>
     </w:p>
     <w:p>
@@ -3662,7 +3662,7 @@
           <w:highlight w:val="yellow"/>
           <w:rtl w:val="0"/>
         </w:rPr>
-        <w:t>Retrieval сократил средний вход с 12 274 до 921–1117 токенов, но точность статуса осталась 10/12 во всех режимах. Evidence F1 снизился с 1,00 в A до 0,56 в B/C: поиск пропустил C09 в Q06 и часть оснований Q07.</w:t>
+        <w:t>BM25 сократил вход с 12 274 до 921–1117 токенов при той же точности статуса 10/12. Evidence F1 снизился с 1,00 до 0,56: поиск пропустил C09 в Q06 и часть оснований Q07.</w:t>
       </w:r>
     </w:p>
     <w:p>
@@ -3680,7 +3680,7 @@
           <w:highlight w:val="yellow"/>
           <w:rtl w:val="0"/>
         </w:rPr>
-        <w:t>На исходных противоречиях Q09–Q10 B и C ответили both. Среди 47 валидных пар B/C при одинаковых ID статусы различались в четырёх случаях; общего улучшения от группировки не видно.</w:t>
+        <w:t>На Q09–Q10 режимы B и C ответили both. В 47 валидных парах с одинаковыми ID статусы различались четырежды; общего преимущества группировки нет.</w:t>
       </w:r>
     </w:p>
     <w:p>
@@ -3698,7 +3698,7 @@
           <w:highlight w:val="yellow"/>
           <w:rtl w:val="0"/>
         </w:rPr>
-        <w:t>На Q11–Q12 все режимы верно ответили insufficient без уверенной однозначной догадки. В B/C ошибочный insufficient на Q06 и Q07 связан с потерей оснований при поиске.</w:t>
+        <w:t>На Q11–Q12 все режимы верно отказались от вывода без уверенной догадки. Ошибочный insufficient в B/C на Q06–Q07 связан с потерей оснований.</w:t>
       </w:r>
     </w:p>
     <w:p>
@@ -3839,7 +3839,7 @@
           <w:highlight w:val="yellow"/>
           <w:rtl w:val="0"/>
         </w:rPr>
-        <w:t>Распределение задач приведено в таблице 5. Все участники проверили текущие данные по сообщению представителя команды.</w:t>
+        <w:t>Вклад участников указан в таблице 5.</w:t>
       </w:r>
     </w:p>
     <w:p>
@@ -4312,7 +4312,7 @@
           <w:highlight w:val="yellow"/>
           <w:rtl w:val="0"/>
         </w:rPr>
-        <w:t>Точность режимов составила 10/12; A показал лучший Evidence F1: 1,00 против 0,56. P-adic преимущества не показал. Перестановки сохраняли статусы; реакция на удаление посылки была надёжнее реакции на противоречие. Ограничения: один корпус, модель, прогон.</w:t>
+        <w:t>По результатам эксперимента ни один режим не получил преимущества по точности статусов: каждый дал 10 верных ответов из 12. Среди валидных ответов полный контекст обеспечил наиболее полные доказательства: Evidence F1 составил 1,00 против 0,56 у BM25 и p-adic режима. Сокращение контекста существенно уменьшило число токенов, но привело к потере важных посылок. P-adic группировка не показала общего улучшения при одинаковом наборе утверждений. После перестановки статусы сохранялись во всех 32 валидных парах. Удаление необходимой посылки вызвало ожидаемый отказ в 11 случаях из 12, тогда как добавление противоречия дало ожидаемый статус лишь в 20 из 34 валидных пар. Эти выводы ограничены одним корпусом, одной моделью и одним прогоном.</w:t>
       </w:r>
       <w:r>
         <w:rPr>

</xml_diff>